<commit_message>
Enhance Dashboard functionality: update download buttons to use JavaScript for PDF generation, improve layout with additional fields in the monthly report, and add dynamic label updates for better user experience. Clean up unused code in the invitation template.
</commit_message>
<xml_diff>
--- a/public/templates/undangan_template.docx
+++ b/public/templates/undangan_template.docx
@@ -938,31 +938,8 @@
         <w:t xml:space="preserve">                Sudaryanto, S.T., M.Eng.</w:t>
       </w:r>
     </w:p>
-    <w:p>
-      <w:pPr>
-        <w:rPr>
-          <w:rFonts w:ascii="Arial" w:hAnsi="Arial" w:cs="Arial"/>
-          <w:sz w:val="22"/>
-          <w:szCs w:val="22"/>
-          <w:lang w:val="sv-SE"/>
-        </w:rPr>
-        <w:sectPr>
-          <w:pgSz w:w="12240" w:h="15840"/>
-          <w:pgMar w:top="1440" w:right="1440" w:bottom="1440" w:left="1440" w:header="720" w:footer="720" w:gutter="0"/>
-          <w:cols w:space="720"/>
-          <w:docGrid w:linePitch="360"/>
-        </w:sectPr>
-      </w:pPr>
-    </w:p>
-    <w:p>
-      <w:pPr>
-        <w:rPr>
-          <w:lang w:val="sv-SE"/>
-        </w:rPr>
-      </w:pPr>
-    </w:p>
     <w:sectPr>
-      <w:pgSz w:w="15840" w:h="12240" w:orient="landscape"/>
+      <w:pgSz w:w="12240" w:h="15840"/>
       <w:pgMar w:top="1440" w:right="1440" w:bottom="1440" w:left="1440" w:header="720" w:footer="720" w:gutter="0"/>
       <w:cols w:space="720"/>
       <w:docGrid w:linePitch="360"/>

</xml_diff>

<commit_message>
Implement pagination for Notulensi and Undangan views: add getPaginated method in models, update controllers to fetch paginated data, and enhance views with pagination controls. Refactor index views to improve readability and maintainability.
</commit_message>
<xml_diff>
--- a/public/templates/undangan_template.docx
+++ b/public/templates/undangan_template.docx
@@ -225,6 +225,12 @@
           <w:lang w:val="sv-SE"/>
         </w:rPr>
         <w:t>Kepada Yth</w:t>
+      </w:r>
+      <w:r>
+        <w:rPr>
+          <w:rFonts w:ascii="Arial" w:hAnsi="Arial" w:cs="Arial"/>
+          <w:lang w:val="sv-SE"/>
+        </w:rPr>
         <w:tab/>
         <w:t xml:space="preserve">:  </w:t>
       </w:r>
@@ -249,7 +255,19 @@
           <w:lang w:val="sv-SE"/>
         </w:rPr>
         <w:t>Dari</w:t>
+      </w:r>
+      <w:r>
+        <w:rPr>
+          <w:rFonts w:ascii="Arial" w:hAnsi="Arial" w:cs="Arial"/>
+          <w:lang w:val="sv-SE"/>
+        </w:rPr>
         <w:tab/>
+      </w:r>
+      <w:r>
+        <w:rPr>
+          <w:rFonts w:ascii="Arial" w:hAnsi="Arial" w:cs="Arial"/>
+          <w:lang w:val="sv-SE"/>
+        </w:rPr>
         <w:tab/>
         <w:t xml:space="preserve">:  </w:t>
       </w:r>
@@ -295,8 +313,14 @@
           <w:lang w:val="sv-SE"/>
         </w:rPr>
         <w:t>Perihal</w:t>
+      </w:r>
+      <w:r>
+        <w:rPr>
+          <w:rFonts w:ascii="Arial" w:hAnsi="Arial" w:cs="Arial"/>
+          <w:lang w:val="sv-SE"/>
+        </w:rPr>
         <w:tab/>
-        <w:t xml:space="preserve">:  {{PERIHAL}}</w:t>
+        <w:t>:  {{PERIHAL}}</w:t>
       </w:r>
     </w:p>
     <w:p>
@@ -408,6 +432,12 @@
           <w:lang w:val="id-ID"/>
         </w:rPr>
         <w:t>1.</w:t>
+      </w:r>
+      <w:r>
+        <w:rPr>
+          <w:rFonts w:ascii="Arial" w:hAnsi="Arial" w:cs="Arial"/>
+          <w:lang w:val="id-ID"/>
+        </w:rPr>
         <w:tab/>
       </w:r>
       <w:r>
@@ -462,6 +492,12 @@
           <w:lang w:val="id-ID"/>
         </w:rPr>
         <w:t>2.</w:t>
+      </w:r>
+      <w:r>
+        <w:rPr>
+          <w:rFonts w:ascii="Arial" w:hAnsi="Arial" w:cs="Arial"/>
+          <w:lang w:val="id-ID"/>
+        </w:rPr>
         <w:tab/>
       </w:r>
       <w:r>
@@ -527,22 +563,20 @@
           <w:rFonts w:ascii="Arial" w:hAnsi="Arial" w:cs="Arial"/>
         </w:rPr>
         <w:t>Waktu</w:t>
+      </w:r>
+      <w:r>
+        <w:rPr>
+          <w:rFonts w:ascii="Arial" w:hAnsi="Arial" w:cs="Arial"/>
+        </w:rPr>
         <w:tab/>
         <w:t xml:space="preserve">: </w:t>
       </w:r>
       <w:r>
         <w:rPr>
           <w:rFonts w:ascii="Arial" w:hAnsi="Arial" w:cs="Arial"/>
-          <w:lang w:val="en-US"/>
-        </w:rPr>
-        <w:t>09.00</w:t>
-      </w:r>
-      <w:r>
-        <w:rPr>
-          <w:rFonts w:ascii="Arial" w:hAnsi="Arial" w:cs="Arial"/>
           <w:lang w:val="id-ID"/>
         </w:rPr>
-        <w:t xml:space="preserve"> {{WAKTU}}</w:t>
+        <w:t>{{WAKTU}}</w:t>
       </w:r>
     </w:p>
     <w:p>
@@ -564,6 +598,12 @@
           <w:lang w:val="en-US"/>
         </w:rPr>
         <w:t>Tempat</w:t>
+      </w:r>
+      <w:r>
+        <w:rPr>
+          <w:rFonts w:ascii="Arial" w:hAnsi="Arial" w:cs="Arial"/>
+          <w:lang w:val="en-US"/>
+        </w:rPr>
         <w:tab/>
         <w:t xml:space="preserve">: </w:t>
       </w:r>
@@ -596,6 +636,12 @@
           <w:lang w:val="en-US"/>
         </w:rPr>
         <w:t>Pimpinan</w:t>
+      </w:r>
+      <w:r>
+        <w:rPr>
+          <w:rFonts w:ascii="Arial" w:hAnsi="Arial" w:cs="Arial"/>
+          <w:lang w:val="en-US"/>
+        </w:rPr>
         <w:tab/>
         <w:t>: Ketua Program Studi Informatika</w:t>
       </w:r>
@@ -691,6 +737,12 @@
           <w:lang w:val="sv-SE"/>
         </w:rPr>
         <w:t xml:space="preserve">                                                                          </w:t>
+      </w:r>
+      <w:r>
+        <w:rPr>
+          <w:rFonts w:ascii="Arial" w:hAnsi="Arial" w:cs="Arial"/>
+          <w:lang w:val="sv-SE"/>
+        </w:rPr>
         <w:tab/>
         <w:t xml:space="preserve">            Yogyakarta,  </w:t>
       </w:r>
@@ -839,6 +891,12 @@
           <w:lang w:val="sv-SE"/>
         </w:rPr>
         <w:tab/>
+      </w:r>
+      <w:r>
+        <w:rPr>
+          <w:rFonts w:ascii="Arial" w:hAnsi="Arial" w:cs="Arial"/>
+          <w:lang w:val="sv-SE"/>
+        </w:rPr>
         <w:tab/>
         <w:t xml:space="preserve">                      Sekretaris </w:t>
       </w:r>

</xml_diff>